<commit_message>
O roteiro da Casa 03 fala da saída sem acompanhante como a tela, e o ensaio do roteiro passa pelas abas do perfil
O ensaio do roteiro não rodava desde a fase 207 e reprovava em cinco tarefas
sem defeito no sistema: procurava no perfil sem passar pelas abas e buscava os
nomes de antes da portaria em abas. O roteiro dizia sai sozinho; a tela diz sem
acompanhante desde a 207. Word regerado.

Co-Authored-By: Claude Opus 5.5 <noreply@anthropic.com>
Claude-Session: https://claude.ai/code/session_01N38UQXXwryqHc97m2CQPnh
</commit_message>
<xml_diff>
--- a/docs/roteiro-marcelo.docx
+++ b/docs/roteiro-marcelo.docx
@@ -619,7 +619,7 @@
           <w:sz w:val="20"/>
           <w:szCs w:val="20"/>
         </w:rPr>
-        <w:t xml:space="preserve">A autorização para sair sozinho é registrada como situação (sai sozinho, sai acompanhado, não sai sozinho), com motivo, autor e prazo de revisão.</w:t>
+        <w:t xml:space="preserve">A autorização para sair sem acompanhante é decidida pela equipe da casa e registrada como situação (pode sair sem acompanhante, só sai com acompanhante, não pode sair sem acompanhante), com motivo, autor e desde quando. A portaria vê o que vale, sem o motivo.</w:t>
       </w:r>
     </w:p>
     <w:p>
@@ -4409,7 +4409,7 @@
           <w:sz w:val="21"/>
           <w:szCs w:val="21"/>
         </w:rPr>
-        <w:t xml:space="preserve"> Observar: ela encontra a autorização no perfil? Entende que é uma situação (sai sozinho, sai acompanhado, não sai sozinho), com motivo, autor e prazo de revisão? Se ela pedir pontos, nota ou algum número para medir confiança, anote a frase e informe que não há. Pergunte o que ela usaria no lugar.</w:t>
+        <w:t xml:space="preserve"> Observar: ela encontra a autorização no perfil? Entende que é uma situação (pode sair sem acompanhante, só sai com acompanhante, não pode sair sem acompanhante), com motivo, autor e desde quando? Se ela pedir pontos, nota ou algum número para medir confiança, anote a frase e informe que não há. Pergunte o que ela usaria no lugar.</w:t>
       </w:r>
     </w:p>
     <w:p>

</xml_diff>

<commit_message>
O roteiro da Casa 03 pede o Corrigir no contato e ganha as tarefas da área restrita, do atendimento com o desenho e do laudo da alergia
Co-Authored-By: Claude Opus 5.5 <noreply@anthropic.com>
Claude-Session: https://claude.ai/code/session_01N38UQXXwryqHc97m2CQPnh
</commit_message>
<xml_diff>
--- a/docs/roteiro-marcelo.docx
+++ b/docs/roteiro-marcelo.docx
@@ -637,6 +637,90 @@
           <w:szCs w:val="20"/>
         </w:rPr>
         <w:t xml:space="preserve">A portaria tem acesso próprio, com a relação de visitantes autorizados de cada acolhido, a foto 3x4 e o registro de entrada e saída das visitas.</w:t>
+      </w:r>
+    </w:p>
+    <w:p>
+      <w:pPr>
+        <w:pStyle w:val="ListParagraph"/>
+        <w:numPr>
+          <w:ilvl w:val="0"/>
+          <w:numId w:val="1"/>
+        </w:numPr>
+        <w:spacing w:after="60"/>
+      </w:pPr>
+      <w:r>
+        <w:rPr>
+          <w:sz w:val="20"/>
+          <w:szCs w:val="20"/>
+        </w:rPr>
+        <w:t xml:space="preserve">O contato de quem aparece pela criança se corrige pelo botão </w:t>
+      </w:r>
+      <w:r>
+        <w:rPr>
+          <w:i/>
+          <w:iCs/>
+          <w:sz w:val="20"/>
+          <w:szCs w:val="20"/>
+        </w:rPr>
+        <w:t xml:space="preserve">Corrigir</w:t>
+      </w:r>
+      <w:r>
+        <w:rPr>
+          <w:sz w:val="20"/>
+          <w:szCs w:val="20"/>
+        </w:rPr>
+        <w:t xml:space="preserve">, com o motivo, e o que constava antes fica guardado. Encerrar continua sendo para quem deixou de fazer parte da vida da criança.</w:t>
+      </w:r>
+    </w:p>
+    <w:p>
+      <w:pPr>
+        <w:pStyle w:val="ListParagraph"/>
+        <w:numPr>
+          <w:ilvl w:val="0"/>
+          <w:numId w:val="1"/>
+        </w:numPr>
+        <w:spacing w:after="60"/>
+      </w:pPr>
+      <w:r>
+        <w:rPr>
+          <w:sz w:val="20"/>
+          <w:szCs w:val="20"/>
+        </w:rPr>
+        <w:t xml:space="preserve">A área restrita do Judiciário guarda os documentos dela: a guia, as decisões e o relatório de acolhimento, em PDF ou fotografados pela câmera.</w:t>
+      </w:r>
+    </w:p>
+    <w:p>
+      <w:pPr>
+        <w:pStyle w:val="ListParagraph"/>
+        <w:numPr>
+          <w:ilvl w:val="0"/>
+          <w:numId w:val="1"/>
+        </w:numPr>
+        <w:spacing w:after="60"/>
+      </w:pPr>
+      <w:r>
+        <w:rPr>
+          <w:sz w:val="20"/>
+          <w:szCs w:val="20"/>
+        </w:rPr>
+        <w:t xml:space="preserve">Na aba Saúde do perfil, cada alergia, condição e restrição alimentar recebe o laudo ou a receita, e os remédios da criança aparecem com as receitas.</w:t>
+      </w:r>
+    </w:p>
+    <w:p>
+      <w:pPr>
+        <w:pStyle w:val="ListParagraph"/>
+        <w:numPr>
+          <w:ilvl w:val="0"/>
+          <w:numId w:val="1"/>
+        </w:numPr>
+        <w:spacing w:after="60"/>
+      </w:pPr>
+      <w:r>
+        <w:rPr>
+          <w:sz w:val="20"/>
+          <w:szCs w:val="20"/>
+        </w:rPr>
+        <w:t xml:space="preserve">A equipe técnica registra o atendimento da criança (psicologia, psicopedagogia, serviço social) com os arquivos, como o desenho feito na sessão. Leem a equipe técnica, a coordenação e a gestão.</w:t>
       </w:r>
     </w:p>
     <w:p>
@@ -4103,7 +4187,39 @@
           <w:sz w:val="21"/>
           <w:szCs w:val="21"/>
         </w:rPr>
-        <w:t xml:space="preserve">? Entende que o contato antigo é encerrado com motivo, e não apagado? Repara na marca de aproximação restrita, e o que comenta sobre ela?</w:t>
+        <w:t xml:space="preserve"> e o botão </w:t>
+      </w:r>
+      <w:r>
+        <w:rPr>
+          <w:i/>
+          <w:iCs/>
+          <w:sz w:val="21"/>
+          <w:szCs w:val="21"/>
+        </w:rPr>
+        <w:t xml:space="preserve">Corrigir</w:t>
+      </w:r>
+      <w:r>
+        <w:rPr>
+          <w:sz w:val="21"/>
+          <w:szCs w:val="21"/>
+        </w:rPr>
+        <w:t xml:space="preserve"> no contato, ou encerra o contato e cadastra de novo? Repara que a correção pede o motivo e que o telefone anterior fica em </w:t>
+      </w:r>
+      <w:r>
+        <w:rPr>
+          <w:i/>
+          <w:iCs/>
+          <w:sz w:val="21"/>
+          <w:szCs w:val="21"/>
+        </w:rPr>
+        <w:t xml:space="preserve">Correções anteriores</w:t>
+      </w:r>
+      <w:r>
+        <w:rPr>
+          <w:sz w:val="21"/>
+          <w:szCs w:val="21"/>
+        </w:rPr>
+        <w:t xml:space="preserve">? Entende que encerrar é para quem deixou de fazer parte da vida da criança, com motivo, e não para mudar um número? Repara na marca de aproximação restrita, e o que comenta sobre ela?</w:t>
       </w:r>
     </w:p>
     <w:p>
@@ -4619,6 +4735,121 @@
     </w:p>
     <w:p>
       <w:pPr>
+        <w:spacing w:after="100" w:line="280"/>
+        <w:jc w:val="both"/>
+      </w:pPr>
+      <w:r>
+        <w:rPr>
+          <w:sz w:val="20"/>
+          <w:szCs w:val="20"/>
+        </w:rPr>
+        <w:t xml:space="preserve">13.1. </w:t>
+      </w:r>
+      <w:r>
+        <w:rPr>
+          <w:b/>
+          <w:bCs/>
+          <w:sz w:val="20"/>
+          <w:szCs w:val="20"/>
+        </w:rPr>
+        <w:t xml:space="preserve">Chegaram a guia de acolhimento e o relatório de quando a Alice veio para a casa. Guarde os dois no sistema.</w:t>
+      </w:r>
+      <w:r>
+        <w:rPr>
+          <w:sz w:val="20"/>
+          <w:szCs w:val="20"/>
+        </w:rPr>
+        <w:t xml:space="preserve"> Observar: ela procura no Judiciário e abre a área restrita? Encontra os documentos logo abaixo da situação judicial, com o item </w:t>
+      </w:r>
+      <w:r>
+        <w:rPr>
+          <w:i/>
+          <w:iCs/>
+          <w:sz w:val="20"/>
+          <w:szCs w:val="20"/>
+        </w:rPr>
+        <w:t xml:space="preserve">Relatório de acolhimento</w:t>
+      </w:r>
+      <w:r>
+        <w:rPr>
+          <w:sz w:val="20"/>
+          <w:szCs w:val="20"/>
+        </w:rPr>
+        <w:t xml:space="preserve">? Fotografa o papel pela câmera ou anexa o PDF? Repara que o documento entra ainda por conferir? Pergunte: </w:t>
+      </w:r>
+      <w:r>
+        <w:rPr>
+          <w:i/>
+          <w:iCs/>
+          <w:sz w:val="20"/>
+          <w:szCs w:val="20"/>
+        </w:rPr>
+        <w:t xml:space="preserve">quem mais, na casa, deveria poder abrir estes documentos?</w:t>
+      </w:r>
+    </w:p>
+    <w:p>
+      <w:pPr>
+        <w:spacing w:after="100" w:line="280"/>
+        <w:jc w:val="both"/>
+      </w:pPr>
+      <w:r>
+        <w:rPr>
+          <w:sz w:val="20"/>
+          <w:szCs w:val="20"/>
+        </w:rPr>
+        <w:t xml:space="preserve">13.2. </w:t>
+      </w:r>
+      <w:r>
+        <w:rPr>
+          <w:b/>
+          <w:bCs/>
+          <w:sz w:val="20"/>
+          <w:szCs w:val="20"/>
+        </w:rPr>
+        <w:t xml:space="preserve">A psicóloga atendeu a Alice hoje, e ela fez um desenho da família. Registre o atendimento com o desenho.</w:t>
+      </w:r>
+      <w:r>
+        <w:rPr>
+          <w:sz w:val="20"/>
+          <w:szCs w:val="20"/>
+        </w:rPr>
+        <w:t xml:space="preserve"> Observar: ela encontra </w:t>
+      </w:r>
+      <w:r>
+        <w:rPr>
+          <w:i/>
+          <w:iCs/>
+          <w:sz w:val="20"/>
+          <w:szCs w:val="20"/>
+        </w:rPr>
+        <w:t xml:space="preserve">Registrar atendimento da equipe técnica</w:t>
+      </w:r>
+      <w:r>
+        <w:rPr>
+          <w:sz w:val="20"/>
+          <w:szCs w:val="20"/>
+        </w:rPr>
+        <w:t xml:space="preserve"> na aba Atendimentos do perfil? Escolhe a área, escreve o que foi trabalhado e fotografa o desenho? Repara que o atendimento não se edita depois? Pergunte: </w:t>
+      </w:r>
+      <w:r>
+        <w:rPr>
+          <w:i/>
+          <w:iCs/>
+          <w:sz w:val="20"/>
+          <w:szCs w:val="20"/>
+        </w:rPr>
+        <w:t xml:space="preserve">quem da casa deveria ler este registro? O educador deveria saber ao menos que houve atendimento?</w:t>
+      </w:r>
+      <w:r>
+        <w:rPr>
+          <w:sz w:val="20"/>
+          <w:szCs w:val="20"/>
+        </w:rPr>
+        <w:t xml:space="preserve"> A resposta vai para a pergunta 4.24 da reunião.</w:t>
+      </w:r>
+    </w:p>
+    <w:p>
+      <w:pPr>
         <w:keepNext/>
         <w:spacing w:after="60" w:before="200"/>
       </w:pPr>
@@ -5391,6 +5622,76 @@
           <w:szCs w:val="16"/>
         </w:rPr>
         <w:t xml:space="preserve"/>
+      </w:r>
+    </w:p>
+    <w:p>
+      <w:pPr>
+        <w:spacing w:after="100" w:line="280"/>
+        <w:jc w:val="both"/>
+      </w:pPr>
+      <w:r>
+        <w:rPr>
+          <w:sz w:val="20"/>
+          <w:szCs w:val="20"/>
+        </w:rPr>
+        <w:t xml:space="preserve">8.1. </w:t>
+      </w:r>
+      <w:r>
+        <w:rPr>
+          <w:b/>
+          <w:bCs/>
+          <w:sz w:val="20"/>
+          <w:szCs w:val="20"/>
+        </w:rPr>
+        <w:t xml:space="preserve">A Alice voltou da consulta com o laudo da alergia ao amendoim. Guarde o laudo junto da alergia.</w:t>
+      </w:r>
+      <w:r>
+        <w:rPr>
+          <w:sz w:val="20"/>
+          <w:szCs w:val="20"/>
+        </w:rPr>
+        <w:t xml:space="preserve"> Observar: ela vai ao perfil, na aba Saúde, e encontra </w:t>
+      </w:r>
+      <w:r>
+        <w:rPr>
+          <w:i/>
+          <w:iCs/>
+          <w:sz w:val="20"/>
+          <w:szCs w:val="20"/>
+        </w:rPr>
+        <w:t xml:space="preserve">Anexar laudo ou receita</w:t>
+      </w:r>
+      <w:r>
+        <w:rPr>
+          <w:sz w:val="20"/>
+          <w:szCs w:val="20"/>
+        </w:rPr>
+        <w:t xml:space="preserve"> ao lado da alergia, ou procura no dossiê? Depois, encontra a receita de um remédio da Alice em </w:t>
+      </w:r>
+      <w:r>
+        <w:rPr>
+          <w:i/>
+          <w:iCs/>
+          <w:sz w:val="20"/>
+          <w:szCs w:val="20"/>
+        </w:rPr>
+        <w:t xml:space="preserve">Remédios e receitas</w:t>
+      </w:r>
+      <w:r>
+        <w:rPr>
+          <w:sz w:val="20"/>
+          <w:szCs w:val="20"/>
+        </w:rPr>
+        <w:t xml:space="preserve">, no mesmo lugar? Pergunte: </w:t>
+      </w:r>
+      <w:r>
+        <w:rPr>
+          <w:i/>
+          <w:iCs/>
+          <w:sz w:val="20"/>
+          <w:szCs w:val="20"/>
+        </w:rPr>
+        <w:t xml:space="preserve">o educador de plantão deveria poder abrir este laudo?</w:t>
       </w:r>
     </w:p>
     <w:p>

</xml_diff>

<commit_message>
O perfil da criança abre nos dados dela, com a família, e cada aba vira ferramenta de trabalho com os números dela (em conferência)
- Aba Geral: idade, casa, tempo de acolhimento, escola, PIA, equipe de
  referência, família, cuidados essenciais e identificação.
- A aba Hoje e o remédio de hoje saem do perfil: o dia é do Dia e da ATA.
- Dia a dia para consultar o que a casa registrou, dia por dia.
- Atendimentos só da equipe técnica, em relatório linear, o mais novo em cima,
  com filtro por área.
- GET /reports/acolhido/:id/numeros com os números de cada aba.

Suíte e ensaios ainda em conferência.

Co-Authored-By: Claude Opus 5.5 <noreply@anthropic.com>
Claude-Session: https://claude.ai/code/session_01N38UQXXwryqHc97m2CQPnh
</commit_message>
<xml_diff>
--- a/docs/roteiro-marcelo.docx
+++ b/docs/roteiro-marcelo.docx
@@ -721,6 +721,71 @@
           <w:szCs w:val="20"/>
         </w:rPr>
         <w:t xml:space="preserve">A equipe técnica registra o atendimento da criança (psicologia, psicopedagogia, serviço social) com os arquivos, como o desenho feito na sessão. Leem a equipe técnica, a coordenação e a gestão.</w:t>
+      </w:r>
+    </w:p>
+    <w:p>
+      <w:pPr>
+        <w:pStyle w:val="ListParagraph"/>
+        <w:numPr>
+          <w:ilvl w:val="0"/>
+          <w:numId w:val="1"/>
+        </w:numPr>
+        <w:spacing w:after="60"/>
+      </w:pPr>
+      <w:r>
+        <w:rPr>
+          <w:sz w:val="20"/>
+          <w:szCs w:val="20"/>
+        </w:rPr>
+        <w:t xml:space="preserve">O perfil da criança abre na aba </w:t>
+      </w:r>
+      <w:r>
+        <w:rPr>
+          <w:i/>
+          <w:iCs/>
+          <w:sz w:val="20"/>
+          <w:szCs w:val="20"/>
+        </w:rPr>
+        <w:t xml:space="preserve">Geral</w:t>
+      </w:r>
+      <w:r>
+        <w:rPr>
+          <w:sz w:val="20"/>
+          <w:szCs w:val="20"/>
+        </w:rPr>
+        <w:t xml:space="preserve">, com os dados dela: idade, casa, há quanto tempo está no acolhimento, escola, PIA, equipe de referência e a família. O dia de hoje fica no Dia e na ATA. O que a casa registrou em cada dia se consulta na aba </w:t>
+      </w:r>
+      <w:r>
+        <w:rPr>
+          <w:i/>
+          <w:iCs/>
+          <w:sz w:val="20"/>
+          <w:szCs w:val="20"/>
+        </w:rPr>
+        <w:t xml:space="preserve">Dia a dia</w:t>
+      </w:r>
+      <w:r>
+        <w:rPr>
+          <w:sz w:val="20"/>
+          <w:szCs w:val="20"/>
+        </w:rPr>
+        <w:t xml:space="preserve">, e a aba </w:t>
+      </w:r>
+      <w:r>
+        <w:rPr>
+          <w:i/>
+          <w:iCs/>
+          <w:sz w:val="20"/>
+          <w:szCs w:val="20"/>
+        </w:rPr>
+        <w:t xml:space="preserve">Atendimentos</w:t>
+      </w:r>
+      <w:r>
+        <w:rPr>
+          <w:sz w:val="20"/>
+          <w:szCs w:val="20"/>
+        </w:rPr>
+        <w:t xml:space="preserve"> é o relatório da equipe técnica, o mais recente em cima. Cada aba traz os números da criança.</w:t>
       </w:r>
     </w:p>
     <w:p>
@@ -2708,6 +2773,60 @@
     </w:p>
     <w:p>
       <w:pPr>
+        <w:spacing w:after="100" w:line="280"/>
+        <w:jc w:val="both"/>
+      </w:pPr>
+      <w:r>
+        <w:rPr>
+          <w:sz w:val="20"/>
+          <w:szCs w:val="20"/>
+        </w:rPr>
+        <w:t xml:space="preserve">13.1. </w:t>
+      </w:r>
+      <w:r>
+        <w:rPr>
+          <w:b/>
+          <w:bCs/>
+          <w:sz w:val="20"/>
+          <w:szCs w:val="20"/>
+        </w:rPr>
+        <w:t xml:space="preserve">A mãe da Alice ligou perguntando se ela almoçou bem ontem. Onde você confere?</w:t>
+      </w:r>
+      <w:r>
+        <w:rPr>
+          <w:sz w:val="20"/>
+          <w:szCs w:val="20"/>
+        </w:rPr>
+        <w:t xml:space="preserve"> Observar: ela abre o perfil da Alice e vai à aba </w:t>
+      </w:r>
+      <w:r>
+        <w:rPr>
+          <w:i/>
+          <w:iCs/>
+          <w:sz w:val="20"/>
+          <w:szCs w:val="20"/>
+        </w:rPr>
+        <w:t xml:space="preserve">Dia a dia</w:t>
+      </w:r>
+      <w:r>
+        <w:rPr>
+          <w:sz w:val="20"/>
+          <w:szCs w:val="20"/>
+        </w:rPr>
+        <w:t xml:space="preserve">? Volta um dia pela seta ou pelo calendário? Encontra o almoço com quem registrou? Pergunte: </w:t>
+      </w:r>
+      <w:r>
+        <w:rPr>
+          <w:i/>
+          <w:iCs/>
+          <w:sz w:val="20"/>
+          <w:szCs w:val="20"/>
+        </w:rPr>
+        <w:t xml:space="preserve">você procuraria aqui ou na ATA de ontem?</w:t>
+      </w:r>
+    </w:p>
+    <w:p>
+      <w:pPr>
         <w:keepNext/>
         <w:spacing w:after="60" w:before="200"/>
       </w:pPr>
@@ -4846,6 +4965,76 @@
           <w:szCs w:val="20"/>
         </w:rPr>
         <w:t xml:space="preserve"> A resposta vai para a pergunta 4.24 da reunião.</w:t>
+      </w:r>
+    </w:p>
+    <w:p>
+      <w:pPr>
+        <w:spacing w:after="100" w:line="280"/>
+        <w:jc w:val="both"/>
+      </w:pPr>
+      <w:r>
+        <w:rPr>
+          <w:sz w:val="20"/>
+          <w:szCs w:val="20"/>
+        </w:rPr>
+        <w:t xml:space="preserve">13.3. </w:t>
+      </w:r>
+      <w:r>
+        <w:rPr>
+          <w:b/>
+          <w:bCs/>
+          <w:sz w:val="20"/>
+          <w:szCs w:val="20"/>
+        </w:rPr>
+        <w:t xml:space="preserve">Amanhã tem audiência da Alice. Diga há quanto tempo ela está acolhida, quando vence o PIA e quando foi o último atendimento de psicopedagogia.</w:t>
+      </w:r>
+      <w:r>
+        <w:rPr>
+          <w:sz w:val="20"/>
+          <w:szCs w:val="20"/>
+        </w:rPr>
+        <w:t xml:space="preserve"> Observar: ela encontra os três na aba </w:t>
+      </w:r>
+      <w:r>
+        <w:rPr>
+          <w:i/>
+          <w:iCs/>
+          <w:sz w:val="20"/>
+          <w:szCs w:val="20"/>
+        </w:rPr>
+        <w:t xml:space="preserve">Geral</w:t>
+      </w:r>
+      <w:r>
+        <w:rPr>
+          <w:sz w:val="20"/>
+          <w:szCs w:val="20"/>
+        </w:rPr>
+        <w:t xml:space="preserve"> e em </w:t>
+      </w:r>
+      <w:r>
+        <w:rPr>
+          <w:i/>
+          <w:iCs/>
+          <w:sz w:val="20"/>
+          <w:szCs w:val="20"/>
+        </w:rPr>
+        <w:t xml:space="preserve">Atendimentos</w:t>
+      </w:r>
+      <w:r>
+        <w:rPr>
+          <w:sz w:val="20"/>
+          <w:szCs w:val="20"/>
+        </w:rPr>
+        <w:t xml:space="preserve">, sem abrir relatório? Usa o filtro por área? Lê o relatório de cima para baixo, do mais recente ao mais antigo? Pergunte: </w:t>
+      </w:r>
+      <w:r>
+        <w:rPr>
+          <w:i/>
+          <w:iCs/>
+          <w:sz w:val="20"/>
+          <w:szCs w:val="20"/>
+        </w:rPr>
+        <w:t xml:space="preserve">que número faltou para você levar à audiência?</w:t>
       </w:r>
     </w:p>
     <w:p>

</xml_diff>

<commit_message>
O roteiro da Casa 03 pede o boletim pela aba Documentos e a dúvida da cozinha pelo Guia do sistema
Duas tarefas novas do educador (13.2 e 13.3) e o que mudou nas fases 230 a
232 no §0. O ensaio do roteiro confere as 56 tarefas.

Co-Authored-By: Claude Opus 5.5 <noreply@anthropic.com>
Claude-Session: https://claude.ai/code/session_01N38UQXXwryqHc97m2CQPnh
</commit_message>
<xml_diff>
--- a/docs/roteiro-marcelo.docx
+++ b/docs/roteiro-marcelo.docx
@@ -786,6 +786,136 @@
           <w:szCs w:val="20"/>
         </w:rPr>
         <w:t xml:space="preserve"> é o relatório da equipe técnica, o mais recente em cima. Cada aba traz os números da criança.</w:t>
+      </w:r>
+    </w:p>
+    <w:p>
+      <w:pPr>
+        <w:pStyle w:val="ListParagraph"/>
+        <w:numPr>
+          <w:ilvl w:val="0"/>
+          <w:numId w:val="1"/>
+        </w:numPr>
+        <w:spacing w:after="60"/>
+      </w:pPr>
+      <w:r>
+        <w:rPr>
+          <w:sz w:val="20"/>
+          <w:szCs w:val="20"/>
+        </w:rPr>
+        <w:t xml:space="preserve">O aniversário, as conquistas, as fotos e as memórias da criança ficam no fim da aba </w:t>
+      </w:r>
+      <w:r>
+        <w:rPr>
+          <w:i/>
+          <w:iCs/>
+          <w:sz w:val="20"/>
+          <w:szCs w:val="20"/>
+        </w:rPr>
+        <w:t xml:space="preserve">Geral</w:t>
+      </w:r>
+      <w:r>
+        <w:rPr>
+          <w:sz w:val="20"/>
+          <w:szCs w:val="20"/>
+        </w:rPr>
+        <w:t xml:space="preserve">. A aba que se chamava Cadastro passou a se chamar </w:t>
+      </w:r>
+      <w:r>
+        <w:rPr>
+          <w:i/>
+          <w:iCs/>
+          <w:sz w:val="20"/>
+          <w:szCs w:val="20"/>
+        </w:rPr>
+        <w:t xml:space="preserve">Documentos</w:t>
+      </w:r>
+      <w:r>
+        <w:rPr>
+          <w:sz w:val="20"/>
+          <w:szCs w:val="20"/>
+        </w:rPr>
+        <w:t xml:space="preserve"> e abre no dossiê e na lista dos documentos da criança; as correções e o registro de quem mexeu no perfil vêm depois.</w:t>
+      </w:r>
+    </w:p>
+    <w:p>
+      <w:pPr>
+        <w:spacing w:after="100" w:line="280"/>
+        <w:jc w:val="both"/>
+      </w:pPr>
+      <w:r>
+        <w:rPr>
+          <w:b/>
+          <w:bCs/>
+          <w:sz w:val="20"/>
+          <w:szCs w:val="20"/>
+        </w:rPr>
+        <w:t xml:space="preserve">Para se orientar</w:t>
+      </w:r>
+    </w:p>
+    <w:p>
+      <w:pPr>
+        <w:pStyle w:val="ListParagraph"/>
+        <w:numPr>
+          <w:ilvl w:val="0"/>
+          <w:numId w:val="1"/>
+        </w:numPr>
+        <w:spacing w:after="60"/>
+      </w:pPr>
+      <w:r>
+        <w:rPr>
+          <w:sz w:val="20"/>
+          <w:szCs w:val="20"/>
+        </w:rPr>
+        <w:t xml:space="preserve">O primeiro item do menu é o </w:t>
+      </w:r>
+      <w:r>
+        <w:rPr>
+          <w:i/>
+          <w:iCs/>
+          <w:sz w:val="20"/>
+          <w:szCs w:val="20"/>
+        </w:rPr>
+        <w:t xml:space="preserve">Guia do sistema</w:t>
+      </w:r>
+      <w:r>
+        <w:rPr>
+          <w:sz w:val="20"/>
+          <w:szCs w:val="20"/>
+        </w:rPr>
+        <w:t xml:space="preserve">. Ele mostra as telas que cada cargo usa, o que se faz em cada uma e o que a Acolhe+AI faz junto, explica as abas do perfil da criança e traz as novidades de cada atualização. Cada tela do Guia tem o botão que leva até ela.</w:t>
+      </w:r>
+    </w:p>
+    <w:p>
+      <w:pPr>
+        <w:pStyle w:val="ListParagraph"/>
+        <w:numPr>
+          <w:ilvl w:val="0"/>
+          <w:numId w:val="1"/>
+        </w:numPr>
+        <w:spacing w:after="60"/>
+      </w:pPr>
+      <w:r>
+        <w:rPr>
+          <w:sz w:val="20"/>
+          <w:szCs w:val="20"/>
+        </w:rPr>
+        <w:t xml:space="preserve">O texto que explica cada tela aparece pela primeira frase, e o botão </w:t>
+      </w:r>
+      <w:r>
+        <w:rPr>
+          <w:i/>
+          <w:iCs/>
+          <w:sz w:val="20"/>
+          <w:szCs w:val="20"/>
+        </w:rPr>
+        <w:t xml:space="preserve">Como funciona</w:t>
+      </w:r>
+      <w:r>
+        <w:rPr>
+          <w:sz w:val="20"/>
+          <w:szCs w:val="20"/>
+        </w:rPr>
+        <w:t xml:space="preserve"> abre o restante. Os alertas e os avisos com números continuam à vista.</w:t>
       </w:r>
     </w:p>
     <w:p>
@@ -2823,6 +2953,121 @@
           <w:szCs w:val="20"/>
         </w:rPr>
         <w:t xml:space="preserve">você procuraria aqui ou na ATA de ontem?</w:t>
+      </w:r>
+    </w:p>
+    <w:p>
+      <w:pPr>
+        <w:spacing w:after="100" w:line="280"/>
+        <w:jc w:val="both"/>
+      </w:pPr>
+      <w:r>
+        <w:rPr>
+          <w:sz w:val="20"/>
+          <w:szCs w:val="20"/>
+        </w:rPr>
+        <w:t xml:space="preserve">13.2. </w:t>
+      </w:r>
+      <w:r>
+        <w:rPr>
+          <w:b/>
+          <w:bCs/>
+          <w:sz w:val="20"/>
+          <w:szCs w:val="20"/>
+        </w:rPr>
+        <w:t xml:space="preserve">A escola pediu o boletim do semestre da Alice. Onde ele está?</w:t>
+      </w:r>
+      <w:r>
+        <w:rPr>
+          <w:sz w:val="20"/>
+          <w:szCs w:val="20"/>
+        </w:rPr>
+        <w:t xml:space="preserve"> Observar: ela abre o perfil da Alice e vai direto à aba </w:t>
+      </w:r>
+      <w:r>
+        <w:rPr>
+          <w:i/>
+          <w:iCs/>
+          <w:sz w:val="20"/>
+          <w:szCs w:val="20"/>
+        </w:rPr>
+        <w:t xml:space="preserve">Documentos</w:t>
+      </w:r>
+      <w:r>
+        <w:rPr>
+          <w:sz w:val="20"/>
+          <w:szCs w:val="20"/>
+        </w:rPr>
+        <w:t xml:space="preserve">, ou procura em outras abas antes? Encontra o boletim na lista ou entra no dossiê? Logo abaixo da lista aparece quantos documentos estão em área restrita ao cargo dela: ela entende que eles existem e que quem os consulta é a equipe técnica? Pergunte: </w:t>
+      </w:r>
+      <w:r>
+        <w:rPr>
+          <w:i/>
+          <w:iCs/>
+          <w:sz w:val="20"/>
+          <w:szCs w:val="20"/>
+        </w:rPr>
+        <w:t xml:space="preserve">o nome Documentos ajudou, ou você procuraria por outro nome?</w:t>
+      </w:r>
+      <w:r>
+        <w:rPr>
+          <w:sz w:val="20"/>
+          <w:szCs w:val="20"/>
+        </w:rPr>
+        <w:t xml:space="preserve"> A resposta mostra se a aba está onde a equipe espera.</w:t>
+      </w:r>
+    </w:p>
+    <w:p>
+      <w:pPr>
+        <w:spacing w:after="100" w:line="280"/>
+        <w:jc w:val="both"/>
+      </w:pPr>
+      <w:r>
+        <w:rPr>
+          <w:sz w:val="20"/>
+          <w:szCs w:val="20"/>
+        </w:rPr>
+        <w:t xml:space="preserve">13.3. </w:t>
+      </w:r>
+      <w:r>
+        <w:rPr>
+          <w:b/>
+          <w:bCs/>
+          <w:sz w:val="20"/>
+          <w:szCs w:val="20"/>
+        </w:rPr>
+        <w:t xml:space="preserve">Você não sabe onde se pede o lanche para a cozinha. Descubra sem perguntar a ninguém.</w:t>
+      </w:r>
+      <w:r>
+        <w:rPr>
+          <w:sz w:val="20"/>
+          <w:szCs w:val="20"/>
+        </w:rPr>
+        <w:t xml:space="preserve"> Observar: ela abre o </w:t>
+      </w:r>
+      <w:r>
+        <w:rPr>
+          <w:i/>
+          <w:iCs/>
+          <w:sz w:val="20"/>
+          <w:szCs w:val="20"/>
+        </w:rPr>
+        <w:t xml:space="preserve">Guia do sistema</w:t>
+      </w:r>
+      <w:r>
+        <w:rPr>
+          <w:sz w:val="20"/>
+          <w:szCs w:val="20"/>
+        </w:rPr>
+        <w:t xml:space="preserve">, o primeiro item do menu, ou procura tela por tela? No Guia, toca na tela para ler o que se faz nela e usa o botão que leva até lá? Pergunte: </w:t>
+      </w:r>
+      <w:r>
+        <w:rPr>
+          <w:i/>
+          <w:iCs/>
+          <w:sz w:val="20"/>
+          <w:szCs w:val="20"/>
+        </w:rPr>
+        <w:t xml:space="preserve">o Guia respondeu a sua dúvida, ou você ainda perguntaria a alguém?</w:t>
       </w:r>
     </w:p>
     <w:p>

</xml_diff>